<commit_message>
Minor tweaks, ran tests
</commit_message>
<xml_diff>
--- a/Chronic Code/P-Value for logisitic regression PLAN.docx
+++ b/Chronic Code/P-Value for logisitic regression PLAN.docx
@@ -324,6 +324,694 @@
       </w:r>
     </w:p>
     <w:p/>
+    <w:p/>
+    <w:p/>
+    <w:p>
+      <w:pPr>
+        <w:pStyle w:val="Heading2"/>
+      </w:pPr>
+      <w:r>
+        <w:lastRenderedPageBreak/>
+        <w:t>Bootstrapping In Detail</w:t>
+      </w:r>
+    </w:p>
+    <w:p>
+      <w:r>
+        <w:br/>
+        <w:t>In proteomic analysis, you are usually dealing with a "high-dimensional" problem: you have measuring thousands of proteins, but you probably only have dozens or hundreds of patients.</w:t>
+      </w:r>
+    </w:p>
+    <w:p>
+      <w:r>
+        <w:t>When trying to figure out which proteins predict if a patient is a </w:t>
+      </w:r>
+      <w:r>
+        <w:rPr>
+          <w:b/>
+          <w:bCs/>
+        </w:rPr>
+        <w:t>Responder</w:t>
+      </w:r>
+      <w:r>
+        <w:t> or </w:t>
+      </w:r>
+      <w:r>
+        <w:rPr>
+          <w:b/>
+          <w:bCs/>
+        </w:rPr>
+        <w:t>Non-Responder</w:t>
+      </w:r>
+      <w:r>
+        <w:t>, researchers often use </w:t>
+      </w:r>
+      <w:r>
+        <w:rPr>
+          <w:b/>
+          <w:bCs/>
+        </w:rPr>
+        <w:t>regularized regression</w:t>
+      </w:r>
+      <w:r>
+        <w:t> (like Lasso or Elastic Net). These models are great because they shrink useless proteins to a coefficient of exactly </w:t>
+      </w:r>
+      <m:oMath>
+        <m:r>
+          <w:rPr>
+            <w:rFonts w:ascii="Cambria Math" w:hAnsi="Cambria Math"/>
+          </w:rPr>
+          <m:t>0</m:t>
+        </m:r>
+      </m:oMath>
+      <w:r>
+        <w:t>, leaving you with a clean list of important proteins.</w:t>
+      </w:r>
+    </w:p>
+    <w:p>
+      <w:r>
+        <w:rPr>
+          <w:b/>
+          <w:bCs/>
+        </w:rPr>
+        <w:t>The Problem:</w:t>
+      </w:r>
+      <w:r>
+        <w:t> Regularized regression is notoriously unstable. If you swap out just two or three patients in your dataset, the model might spit out a completely different list of proteins. Furthermore, because of the complex math used to shrink coefficients to zero, </w:t>
+      </w:r>
+      <w:r>
+        <w:rPr>
+          <w:b/>
+          <w:bCs/>
+        </w:rPr>
+        <w:t>you cannot calculate standard p-values</w:t>
+      </w:r>
+      <w:r>
+        <w:t> for these proteins.</w:t>
+      </w:r>
+    </w:p>
+    <w:p>
+      <w:r>
+        <w:rPr>
+          <w:b/>
+          <w:bCs/>
+        </w:rPr>
+        <w:t>The Solution:</w:t>
+      </w:r>
+      <w:r>
+        <w:t> Feature Stability via Bootstrapping. Here is a detailed breakdown of how it works and why it is the gold standard for your proteomics project.</w:t>
+      </w:r>
+    </w:p>
+    <w:p>
+      <w:r>
+        <w:pict w14:anchorId="3A7B14BB">
+          <v:rect id="_x0000_i1043" style="width:663pt;height:1.5pt" o:hrpct="0" o:hralign="center" o:hrstd="t" o:hr="t" fillcolor="#a0a0a0" stroked="f"/>
+        </w:pict>
+      </w:r>
+    </w:p>
+    <w:p>
+      <w:pPr>
+        <w:rPr>
+          <w:b/>
+          <w:bCs/>
+        </w:rPr>
+      </w:pPr>
+      <w:r>
+        <w:rPr>
+          <w:b/>
+          <w:bCs/>
+        </w:rPr>
+        <w:t>1. How it works: The Bootstrapping Process</w:t>
+      </w:r>
+    </w:p>
+    <w:p>
+      <w:r>
+        <w:t>Imagine your dataset has 100 patients (50 Responders, 50 Non-Responders).</w:t>
+      </w:r>
+    </w:p>
+    <w:p>
+      <w:pPr>
+        <w:numPr>
+          <w:ilvl w:val="0"/>
+          <w:numId w:val="2"/>
+        </w:numPr>
+      </w:pPr>
+      <w:r>
+        <w:rPr>
+          <w:b/>
+          <w:bCs/>
+        </w:rPr>
+        <w:t>Sample with Replacement:</w:t>
+      </w:r>
+      <w:r>
+        <w:t> You tell the computer to randomly draw 100 patients from your dataset to create a "new" dataset. Because it samples </w:t>
+      </w:r>
+      <w:r>
+        <w:rPr>
+          <w:i/>
+          <w:iCs/>
+        </w:rPr>
+        <w:t>with replacement</w:t>
+      </w:r>
+      <w:r>
+        <w:t>, Patient A might be picked three times, while Patient B isn't picked at all.</w:t>
+      </w:r>
+    </w:p>
+    <w:p>
+      <w:pPr>
+        <w:numPr>
+          <w:ilvl w:val="0"/>
+          <w:numId w:val="2"/>
+        </w:numPr>
+      </w:pPr>
+      <w:r>
+        <w:rPr>
+          <w:b/>
+          <w:bCs/>
+        </w:rPr>
+        <w:t>Train the Model:</w:t>
+      </w:r>
+      <w:r>
+        <w:t> You run your regularized regression model on this newly scrambled dataset. The model selects a handful of proteins and assigns them coefficients (weights). You write these down.</w:t>
+      </w:r>
+    </w:p>
+    <w:p>
+      <w:pPr>
+        <w:numPr>
+          <w:ilvl w:val="0"/>
+          <w:numId w:val="2"/>
+        </w:numPr>
+      </w:pPr>
+      <w:r>
+        <w:rPr>
+          <w:b/>
+          <w:bCs/>
+        </w:rPr>
+        <w:t>Repeat:</w:t>
+      </w:r>
+      <w:r>
+        <w:t> You repeat this process 1,000 times.</w:t>
+      </w:r>
+    </w:p>
+    <w:p>
+      <w:r>
+        <w:t>You have now simulated what would happen if you ran your experiment on 1,000 slightly different groups of patients.</w:t>
+      </w:r>
+    </w:p>
+    <w:p>
+      <w:r>
+        <w:pict w14:anchorId="1ED71936">
+          <v:rect id="_x0000_i1044" style="width:663pt;height:1.5pt" o:hrpct="0" o:hralign="center" o:hrstd="t" o:hr="t" fillcolor="#a0a0a0" stroked="f"/>
+        </w:pict>
+      </w:r>
+    </w:p>
+    <w:p>
+      <w:pPr>
+        <w:rPr>
+          <w:b/>
+          <w:bCs/>
+        </w:rPr>
+      </w:pPr>
+      <w:r>
+        <w:rPr>
+          <w:b/>
+          <w:bCs/>
+        </w:rPr>
+        <w:t>2. What it gives you: Selection Frequency (The "Robustness" Check)</w:t>
+      </w:r>
+    </w:p>
+    <w:p>
+      <w:r>
+        <w:t>Now, you look at your 1,000 models and ask: </w:t>
+      </w:r>
+      <w:r>
+        <w:rPr>
+          <w:i/>
+          <w:iCs/>
+        </w:rPr>
+        <w:t>"Out of 1,000 tries, how many times did the model decide Protein X was important enough to keep (coefficient </w:t>
+      </w:r>
+      <m:oMath>
+        <m:r>
+          <m:rPr>
+            <m:sty m:val="p"/>
+          </m:rPr>
+          <w:rPr>
+            <w:rFonts w:ascii="Cambria Math" w:hAnsi="Cambria Math"/>
+          </w:rPr>
+          <m:t>≠</m:t>
+        </m:r>
+      </m:oMath>
+      <w:r>
+        <w:rPr>
+          <w:i/>
+          <w:iCs/>
+        </w:rPr>
+        <w:t> 0)?"</w:t>
+      </w:r>
+    </w:p>
+    <w:p>
+      <w:pPr>
+        <w:numPr>
+          <w:ilvl w:val="0"/>
+          <w:numId w:val="3"/>
+        </w:numPr>
+      </w:pPr>
+      <w:r>
+        <w:rPr>
+          <w:b/>
+          <w:bCs/>
+        </w:rPr>
+        <w:t>Protein A was selected 950 times (95%).</w:t>
+      </w:r>
+      <w:r>
+        <w:t> This means no matter which specific patients were included or excluded in the bootstrap sample, Protein A was almost always needed to tell Responders from Non-Responders. This is a </w:t>
+      </w:r>
+      <w:r>
+        <w:rPr>
+          <w:b/>
+          <w:bCs/>
+        </w:rPr>
+        <w:t>highly robust biomarker</w:t>
+      </w:r>
+      <w:r>
+        <w:t>. It is driving real biology, not just a statistical fluke.</w:t>
+      </w:r>
+    </w:p>
+    <w:p>
+      <w:pPr>
+        <w:numPr>
+          <w:ilvl w:val="0"/>
+          <w:numId w:val="3"/>
+        </w:numPr>
+      </w:pPr>
+      <w:r>
+        <w:rPr>
+          <w:b/>
+          <w:bCs/>
+        </w:rPr>
+        <w:t>Protein B was selected 300 times (30%).</w:t>
+      </w:r>
+      <w:r>
+        <w:t> In the original dataset, Protein B might have looked important. But bootstrapping reveals that it only looks important when certain specific patients are included. It is unstable and highly likely to be a false positive. You should discard it.</w:t>
+      </w:r>
+    </w:p>
+    <w:p>
+      <w:r>
+        <w:rPr>
+          <w:b/>
+          <w:bCs/>
+        </w:rPr>
+        <w:lastRenderedPageBreak/>
+        <w:t>The Proteomics Rule of Thumb:</w:t>
+      </w:r>
+      <w:r>
+        <w:t> Researchers generally only trust proteins that achieve a selection frequency of </w:t>
+      </w:r>
+      <w:r>
+        <w:rPr>
+          <w:b/>
+          <w:bCs/>
+        </w:rPr>
+        <w:t>&gt; 80% or 90%</w:t>
+      </w:r>
+      <w:r>
+        <w:t>.</w:t>
+      </w:r>
+    </w:p>
+    <w:p>
+      <w:r>
+        <w:pict w14:anchorId="3CEEE6D6">
+          <v:rect id="_x0000_i1045" style="width:663pt;height:1.5pt" o:hrpct="0" o:hralign="center" o:hrstd="t" o:hr="t" fillcolor="#a0a0a0" stroked="f"/>
+        </w:pict>
+      </w:r>
+    </w:p>
+    <w:p>
+      <w:pPr>
+        <w:rPr>
+          <w:b/>
+          <w:bCs/>
+        </w:rPr>
+      </w:pPr>
+      <w:r>
+        <w:rPr>
+          <w:b/>
+          <w:bCs/>
+        </w:rPr>
+        <w:t>3. What it gives you: 95% Confidence Intervals (The "P-Value Equivalent")</w:t>
+      </w:r>
+    </w:p>
+    <w:p>
+      <w:r>
+        <w:t>Selection frequency tells you </w:t>
+      </w:r>
+      <w:r>
+        <w:rPr>
+          <w:i/>
+          <w:iCs/>
+        </w:rPr>
+        <w:t>if</w:t>
+      </w:r>
+      <w:r>
+        <w:t> the protein is important, but Confidence Intervals (CIs) tell you about the </w:t>
+      </w:r>
+      <w:r>
+        <w:rPr>
+          <w:b/>
+          <w:bCs/>
+        </w:rPr>
+        <w:t>direction and reliability of its effect.</w:t>
+      </w:r>
+    </w:p>
+    <w:p>
+      <w:r>
+        <w:t>For Protein A, you have 1,000 coefficients generated from your 1,000 models.</w:t>
+      </w:r>
+    </w:p>
+    <w:p>
+      <w:pPr>
+        <w:numPr>
+          <w:ilvl w:val="0"/>
+          <w:numId w:val="4"/>
+        </w:numPr>
+      </w:pPr>
+      <w:r>
+        <w:t>You sort these 1,000 numbers from smallest to largest.</w:t>
+      </w:r>
+    </w:p>
+    <w:p>
+      <w:pPr>
+        <w:numPr>
+          <w:ilvl w:val="0"/>
+          <w:numId w:val="4"/>
+        </w:numPr>
+      </w:pPr>
+      <w:r>
+        <w:t>You chop off the bottom 2.5% and the top 2.5% of extreme values.</w:t>
+      </w:r>
+    </w:p>
+    <w:p>
+      <w:pPr>
+        <w:numPr>
+          <w:ilvl w:val="0"/>
+          <w:numId w:val="4"/>
+        </w:numPr>
+      </w:pPr>
+      <w:r>
+        <w:t>The range of the remaining 95% of the values is your </w:t>
+      </w:r>
+      <w:r>
+        <w:rPr>
+          <w:b/>
+          <w:bCs/>
+        </w:rPr>
+        <w:t>95% Confidence Interval</w:t>
+      </w:r>
+      <w:r>
+        <w:t>.</w:t>
+      </w:r>
+    </w:p>
+    <w:p>
+      <w:r>
+        <w:rPr>
+          <w:b/>
+          <w:bCs/>
+        </w:rPr>
+        <w:t>Why do we care if it "crosses zero"?</w:t>
+      </w:r>
+      <w:r>
+        <w:br/>
+        <w:t>In regression, a coefficient of </w:t>
+      </w:r>
+      <m:oMath>
+        <m:r>
+          <w:rPr>
+            <w:rFonts w:ascii="Cambria Math" w:hAnsi="Cambria Math"/>
+          </w:rPr>
+          <m:t>0</m:t>
+        </m:r>
+      </m:oMath>
+      <w:r>
+        <w:t> means "this protein has no effect."</w:t>
+      </w:r>
+    </w:p>
+    <w:p>
+      <w:pPr>
+        <w:numPr>
+          <w:ilvl w:val="0"/>
+          <w:numId w:val="5"/>
+        </w:numPr>
+      </w:pPr>
+      <w:r>
+        <w:t>A </w:t>
+      </w:r>
+      <w:r>
+        <w:rPr>
+          <w:b/>
+          <w:bCs/>
+        </w:rPr>
+        <w:t>positive</w:t>
+      </w:r>
+      <w:r>
+        <w:t> coefficient might mean: </w:t>
+      </w:r>
+      <w:r>
+        <w:rPr>
+          <w:i/>
+          <w:iCs/>
+        </w:rPr>
+        <w:t>Higher levels of this protein = Higher chance of being a Responder.</w:t>
+      </w:r>
+    </w:p>
+    <w:p>
+      <w:pPr>
+        <w:numPr>
+          <w:ilvl w:val="0"/>
+          <w:numId w:val="5"/>
+        </w:numPr>
+      </w:pPr>
+      <w:r>
+        <w:t>A </w:t>
+      </w:r>
+      <w:r>
+        <w:rPr>
+          <w:b/>
+          <w:bCs/>
+        </w:rPr>
+        <w:t>negative</w:t>
+      </w:r>
+      <w:r>
+        <w:t> coefficient might mean: </w:t>
+      </w:r>
+      <w:r>
+        <w:rPr>
+          <w:i/>
+          <w:iCs/>
+        </w:rPr>
+        <w:t>Higher levels of this protein = Higher chance of being a Non-Responder.</w:t>
+      </w:r>
+    </w:p>
+    <w:p>
+      <w:r>
+        <w:t>Let's look at three scenarios:</w:t>
+      </w:r>
+    </w:p>
+    <w:p>
+      <w:pPr>
+        <w:numPr>
+          <w:ilvl w:val="0"/>
+          <w:numId w:val="6"/>
+        </w:numPr>
+      </w:pPr>
+      <w:r>
+        <w:rPr>
+          <w:b/>
+          <w:bCs/>
+        </w:rPr>
+        <w:t>Scenario 1 (CI is strictly positive, e.g., [0.5 to 2.1]):</w:t>
+      </w:r>
+      <w:r>
+        <w:t> In 95% of our simulations, this protein strongly pushed the prediction toward "Responder." The CI </w:t>
+      </w:r>
+      <w:r>
+        <w:rPr>
+          <w:b/>
+          <w:bCs/>
+        </w:rPr>
+        <w:t>does not cross zero</w:t>
+      </w:r>
+      <w:r>
+        <w:t>. You can be highly confident this is a true Responder biomarker. </w:t>
+      </w:r>
+      <w:r>
+        <w:rPr>
+          <w:i/>
+          <w:iCs/>
+        </w:rPr>
+        <w:t xml:space="preserve">(This is effectively </w:t>
+      </w:r>
+      <w:proofErr w:type="spellStart"/>
+      <w:r>
+        <w:rPr>
+          <w:i/>
+          <w:iCs/>
+        </w:rPr>
+        <w:t>your</w:t>
+      </w:r>
+      <w:proofErr w:type="spellEnd"/>
+      <w:r>
+        <w:rPr>
+          <w:i/>
+          <w:iCs/>
+        </w:rPr>
+        <w:t> </w:t>
+      </w:r>
+      <m:oMath>
+        <m:r>
+          <w:rPr>
+            <w:rFonts w:ascii="Cambria Math" w:hAnsi="Cambria Math"/>
+          </w:rPr>
+          <m:t>p&lt;0.05</m:t>
+        </m:r>
+      </m:oMath>
+      <w:r>
+        <w:rPr>
+          <w:i/>
+          <w:iCs/>
+        </w:rPr>
+        <w:t>)</w:t>
+      </w:r>
+      <w:r>
+        <w:t>.</w:t>
+      </w:r>
+    </w:p>
+    <w:p>
+      <w:pPr>
+        <w:numPr>
+          <w:ilvl w:val="0"/>
+          <w:numId w:val="6"/>
+        </w:numPr>
+      </w:pPr>
+      <w:r>
+        <w:rPr>
+          <w:b/>
+          <w:bCs/>
+        </w:rPr>
+        <w:t>Scenario 2 (CI is strictly negative, e.g., [-1.8 to -0.3]):</w:t>
+      </w:r>
+      <w:r>
+        <w:t> In 95% of simulations, this pushed the prediction toward "Non-Responder." It </w:t>
+      </w:r>
+      <w:r>
+        <w:rPr>
+          <w:b/>
+          <w:bCs/>
+        </w:rPr>
+        <w:t>does not cross zero</w:t>
+      </w:r>
+      <w:r>
+        <w:t>. You are highly confident this is a true Non-Responder biomarker.</w:t>
+      </w:r>
+    </w:p>
+    <w:p>
+      <w:pPr>
+        <w:numPr>
+          <w:ilvl w:val="0"/>
+          <w:numId w:val="6"/>
+        </w:numPr>
+      </w:pPr>
+      <w:r>
+        <w:rPr>
+          <w:b/>
+          <w:bCs/>
+        </w:rPr>
+        <w:t>Scenario 3 (CI crosses zero, e.g., [-0.2 to 1.4]):</w:t>
+      </w:r>
+      <w:r>
+        <w:t> In some simulations, the model thought this protein indicated a Responder. In other simulations, it thought it indicated a Non-Responder. Because the effect crosses zero, </w:t>
+      </w:r>
+      <w:r>
+        <w:rPr>
+          <w:b/>
+          <w:bCs/>
+        </w:rPr>
+        <w:t>the model isn't sure what this protein actually does.</w:t>
+      </w:r>
+      <w:r>
+        <w:t> This is equivalent to a non-significant p-value (</w:t>
+      </w:r>
+      <m:oMath>
+        <m:r>
+          <w:rPr>
+            <w:rFonts w:ascii="Cambria Math" w:hAnsi="Cambria Math"/>
+          </w:rPr>
+          <m:t>p&gt;0.05</m:t>
+        </m:r>
+      </m:oMath>
+      <w:r>
+        <w:t>), and you cannot confidently claim it is a biomarker.</w:t>
+      </w:r>
+    </w:p>
+    <w:p>
+      <w:pPr>
+        <w:rPr>
+          <w:b/>
+          <w:bCs/>
+        </w:rPr>
+      </w:pPr>
+      <w:r>
+        <w:rPr>
+          <w:b/>
+          <w:bCs/>
+        </w:rPr>
+        <w:t>Summary: The Ultimate Biomarker</w:t>
+      </w:r>
+    </w:p>
+    <w:p>
+      <w:r>
+        <w:t>In your proteomics pipeline, if you want to present a protein to your colleagues as a definitive biomarker for treatment response, it must pass both tests from the bootstrap process:</w:t>
+      </w:r>
+    </w:p>
+    <w:p>
+      <w:pPr>
+        <w:numPr>
+          <w:ilvl w:val="0"/>
+          <w:numId w:val="7"/>
+        </w:numPr>
+      </w:pPr>
+      <w:r>
+        <w:rPr>
+          <w:b/>
+          <w:bCs/>
+        </w:rPr>
+        <w:t>It must survive the purge:</w:t>
+      </w:r>
+      <w:r>
+        <w:t> It was selected in &gt;80% of the bootstrap iterations.</w:t>
+      </w:r>
+    </w:p>
+    <w:p>
+      <w:pPr>
+        <w:numPr>
+          <w:ilvl w:val="0"/>
+          <w:numId w:val="7"/>
+        </w:numPr>
+      </w:pPr>
+      <w:r>
+        <w:rPr>
+          <w:b/>
+          <w:bCs/>
+        </w:rPr>
+        <w:t>Its effect must be certain:</w:t>
+      </w:r>
+      <w:r>
+        <w:t> Its 95% Confidence Interval of coefficients must not cross zero.</w:t>
+      </w:r>
+    </w:p>
+    <w:p>
+      <w:r>
+        <w:t>If a protein passes these two tests, it is mathematically proven to be robust against patient-to-patient variance, making it an excellent candidate for clinical validation.</w:t>
+      </w:r>
+    </w:p>
     <w:sectPr>
       <w:pgSz w:w="11906" w:h="16838"/>
       <w:pgMar w:top="1440" w:right="1440" w:bottom="1440" w:left="1440" w:header="708" w:footer="708" w:gutter="0"/>
@@ -337,6 +1025,155 @@
 <file path=word/numbering.xml><?xml version="1.0" encoding="utf-8"?>
 <w:numbering xmlns:wpc="http://schemas.microsoft.com/office/word/2010/wordprocessingCanvas" xmlns:cx="http://schemas.microsoft.com/office/drawing/2014/chartex" xmlns:cx1="http://schemas.microsoft.com/office/drawing/2015/9/8/chartex" xmlns:cx2="http://schemas.microsoft.com/office/drawing/2015/10/21/chartex" xmlns:cx3="http://schemas.microsoft.com/office/drawing/2016/5/9/chartex" xmlns:cx4="http://schemas.microsoft.com/office/drawing/2016/5/10/chartex" xmlns:cx5="http://schemas.microsoft.com/office/drawing/2016/5/11/chartex" xmlns:cx6="http://schemas.microsoft.com/office/drawing/2016/5/12/chartex" xmlns:cx7="http://schemas.microsoft.com/office/drawing/2016/5/13/chartex" xmlns:cx8="http://schemas.microsoft.com/office/drawing/2016/5/14/chartex" xmlns:mc="http://schemas.openxmlformats.org/markup-compatibility/2006" xmlns:aink="http://schemas.microsoft.com/office/drawing/2016/ink" xmlns:am3d="http://schemas.microsoft.com/office/drawing/2017/model3d" xmlns:o="urn:schemas-microsoft-com:office:office" xmlns:oel="http://schemas.microsoft.com/office/2019/extlst" xmlns:r="http://schemas.openxmlformats.org/officeDocument/2006/relationships" xmlns:m="http://schemas.openxmlformats.org/officeDocument/2006/math" xmlns:v="urn:schemas-microsoft-com:vml" xmlns:wp14="http://schemas.microsoft.com/office/word/2010/wordprocessingDrawing" xmlns:wp="http://schemas.openxmlformats.org/drawingml/2006/wordprocessingDrawing" xmlns:w10="urn:schemas-microsoft-com:office:word" xmlns:w="http://schemas.openxmlformats.org/wordprocessingml/2006/main" xmlns:w14="http://schemas.microsoft.com/office/word/2010/wordml" xmlns:w15="http://schemas.microsoft.com/office/word/2012/wordml" xmlns:w16cex="http://schemas.microsoft.com/office/word/2018/wordml/cex" xmlns:w16cid="http://schemas.microsoft.com/office/word/2016/wordml/cid" xmlns:w16="http://schemas.microsoft.com/office/word/2018/wordml" xmlns:w16du="http://schemas.microsoft.com/office/word/2023/wordml/word16du" xmlns:w16sdtdh="http://schemas.microsoft.com/office/word/2020/wordml/sdtdatahash" xmlns:w16sdtfl="http://schemas.microsoft.com/office/word/2024/wordml/sdtformatlock" xmlns:w16se="http://schemas.microsoft.com/office/word/2015/wordml/symex" xmlns:wpg="http://schemas.microsoft.com/office/word/2010/wordprocessingGroup" xmlns:wpi="http://schemas.microsoft.com/office/word/2010/wordprocessingInk" xmlns:wne="http://schemas.microsoft.com/office/word/2006/wordml" xmlns:wps="http://schemas.microsoft.com/office/word/2010/wordprocessingShape" mc:Ignorable="w14 w15 w16se w16cid w16 w16cex w16sdtdh w16sdtfl w16du wp14">
   <w:abstractNum w:abstractNumId="0" w15:restartNumberingAfterBreak="0">
+    <w:nsid w:val="01455498"/>
+    <w:multiLevelType w:val="multilevel"/>
+    <w:tmpl w:val="38AA34BE"/>
+    <w:lvl w:ilvl="0">
+      <w:start w:val="1"/>
+      <w:numFmt w:val="bullet"/>
+      <w:lvlText w:val=""/>
+      <w:lvlJc w:val="left"/>
+      <w:pPr>
+        <w:tabs>
+          <w:tab w:val="num" w:pos="720"/>
+        </w:tabs>
+        <w:ind w:left="720" w:hanging="360"/>
+      </w:pPr>
+      <w:rPr>
+        <w:rFonts w:ascii="Symbol" w:hAnsi="Symbol" w:hint="default"/>
+        <w:sz w:val="20"/>
+      </w:rPr>
+    </w:lvl>
+    <w:lvl w:ilvl="1" w:tentative="1">
+      <w:start w:val="1"/>
+      <w:numFmt w:val="bullet"/>
+      <w:lvlText w:val="o"/>
+      <w:lvlJc w:val="left"/>
+      <w:pPr>
+        <w:tabs>
+          <w:tab w:val="num" w:pos="1440"/>
+        </w:tabs>
+        <w:ind w:left="1440" w:hanging="360"/>
+      </w:pPr>
+      <w:rPr>
+        <w:rFonts w:ascii="Courier New" w:hAnsi="Courier New" w:hint="default"/>
+        <w:sz w:val="20"/>
+      </w:rPr>
+    </w:lvl>
+    <w:lvl w:ilvl="2" w:tentative="1">
+      <w:start w:val="1"/>
+      <w:numFmt w:val="bullet"/>
+      <w:lvlText w:val=""/>
+      <w:lvlJc w:val="left"/>
+      <w:pPr>
+        <w:tabs>
+          <w:tab w:val="num" w:pos="2160"/>
+        </w:tabs>
+        <w:ind w:left="2160" w:hanging="360"/>
+      </w:pPr>
+      <w:rPr>
+        <w:rFonts w:ascii="Wingdings" w:hAnsi="Wingdings" w:hint="default"/>
+        <w:sz w:val="20"/>
+      </w:rPr>
+    </w:lvl>
+    <w:lvl w:ilvl="3" w:tentative="1">
+      <w:start w:val="1"/>
+      <w:numFmt w:val="bullet"/>
+      <w:lvlText w:val=""/>
+      <w:lvlJc w:val="left"/>
+      <w:pPr>
+        <w:tabs>
+          <w:tab w:val="num" w:pos="2880"/>
+        </w:tabs>
+        <w:ind w:left="2880" w:hanging="360"/>
+      </w:pPr>
+      <w:rPr>
+        <w:rFonts w:ascii="Wingdings" w:hAnsi="Wingdings" w:hint="default"/>
+        <w:sz w:val="20"/>
+      </w:rPr>
+    </w:lvl>
+    <w:lvl w:ilvl="4" w:tentative="1">
+      <w:start w:val="1"/>
+      <w:numFmt w:val="bullet"/>
+      <w:lvlText w:val=""/>
+      <w:lvlJc w:val="left"/>
+      <w:pPr>
+        <w:tabs>
+          <w:tab w:val="num" w:pos="3600"/>
+        </w:tabs>
+        <w:ind w:left="3600" w:hanging="360"/>
+      </w:pPr>
+      <w:rPr>
+        <w:rFonts w:ascii="Wingdings" w:hAnsi="Wingdings" w:hint="default"/>
+        <w:sz w:val="20"/>
+      </w:rPr>
+    </w:lvl>
+    <w:lvl w:ilvl="5" w:tentative="1">
+      <w:start w:val="1"/>
+      <w:numFmt w:val="bullet"/>
+      <w:lvlText w:val=""/>
+      <w:lvlJc w:val="left"/>
+      <w:pPr>
+        <w:tabs>
+          <w:tab w:val="num" w:pos="4320"/>
+        </w:tabs>
+        <w:ind w:left="4320" w:hanging="360"/>
+      </w:pPr>
+      <w:rPr>
+        <w:rFonts w:ascii="Wingdings" w:hAnsi="Wingdings" w:hint="default"/>
+        <w:sz w:val="20"/>
+      </w:rPr>
+    </w:lvl>
+    <w:lvl w:ilvl="6" w:tentative="1">
+      <w:start w:val="1"/>
+      <w:numFmt w:val="bullet"/>
+      <w:lvlText w:val=""/>
+      <w:lvlJc w:val="left"/>
+      <w:pPr>
+        <w:tabs>
+          <w:tab w:val="num" w:pos="5040"/>
+        </w:tabs>
+        <w:ind w:left="5040" w:hanging="360"/>
+      </w:pPr>
+      <w:rPr>
+        <w:rFonts w:ascii="Wingdings" w:hAnsi="Wingdings" w:hint="default"/>
+        <w:sz w:val="20"/>
+      </w:rPr>
+    </w:lvl>
+    <w:lvl w:ilvl="7" w:tentative="1">
+      <w:start w:val="1"/>
+      <w:numFmt w:val="bullet"/>
+      <w:lvlText w:val=""/>
+      <w:lvlJc w:val="left"/>
+      <w:pPr>
+        <w:tabs>
+          <w:tab w:val="num" w:pos="5760"/>
+        </w:tabs>
+        <w:ind w:left="5760" w:hanging="360"/>
+      </w:pPr>
+      <w:rPr>
+        <w:rFonts w:ascii="Wingdings" w:hAnsi="Wingdings" w:hint="default"/>
+        <w:sz w:val="20"/>
+      </w:rPr>
+    </w:lvl>
+    <w:lvl w:ilvl="8" w:tentative="1">
+      <w:start w:val="1"/>
+      <w:numFmt w:val="bullet"/>
+      <w:lvlText w:val=""/>
+      <w:lvlJc w:val="left"/>
+      <w:pPr>
+        <w:tabs>
+          <w:tab w:val="num" w:pos="6480"/>
+        </w:tabs>
+        <w:ind w:left="6480" w:hanging="360"/>
+      </w:pPr>
+      <w:rPr>
+        <w:rFonts w:ascii="Wingdings" w:hAnsi="Wingdings" w:hint="default"/>
+        <w:sz w:val="20"/>
+      </w:rPr>
+    </w:lvl>
+  </w:abstractNum>
+  <w:abstractNum w:abstractNumId="1" w15:restartNumberingAfterBreak="0">
     <w:nsid w:val="32A51E69"/>
     <w:multiLevelType w:val="multilevel"/>
     <w:tmpl w:val="C1243BD0"/>
@@ -485,8 +1322,699 @@
       </w:rPr>
     </w:lvl>
   </w:abstractNum>
+  <w:abstractNum w:abstractNumId="2" w15:restartNumberingAfterBreak="0">
+    <w:nsid w:val="47C062BF"/>
+    <w:multiLevelType w:val="multilevel"/>
+    <w:tmpl w:val="2BF4ADC6"/>
+    <w:lvl w:ilvl="0">
+      <w:start w:val="1"/>
+      <w:numFmt w:val="decimal"/>
+      <w:lvlText w:val="%1."/>
+      <w:lvlJc w:val="left"/>
+      <w:pPr>
+        <w:tabs>
+          <w:tab w:val="num" w:pos="720"/>
+        </w:tabs>
+        <w:ind w:left="720" w:hanging="360"/>
+      </w:pPr>
+    </w:lvl>
+    <w:lvl w:ilvl="1" w:tentative="1">
+      <w:start w:val="1"/>
+      <w:numFmt w:val="decimal"/>
+      <w:lvlText w:val="%2."/>
+      <w:lvlJc w:val="left"/>
+      <w:pPr>
+        <w:tabs>
+          <w:tab w:val="num" w:pos="1440"/>
+        </w:tabs>
+        <w:ind w:left="1440" w:hanging="360"/>
+      </w:pPr>
+    </w:lvl>
+    <w:lvl w:ilvl="2" w:tentative="1">
+      <w:start w:val="1"/>
+      <w:numFmt w:val="decimal"/>
+      <w:lvlText w:val="%3."/>
+      <w:lvlJc w:val="left"/>
+      <w:pPr>
+        <w:tabs>
+          <w:tab w:val="num" w:pos="2160"/>
+        </w:tabs>
+        <w:ind w:left="2160" w:hanging="360"/>
+      </w:pPr>
+    </w:lvl>
+    <w:lvl w:ilvl="3" w:tentative="1">
+      <w:start w:val="1"/>
+      <w:numFmt w:val="decimal"/>
+      <w:lvlText w:val="%4."/>
+      <w:lvlJc w:val="left"/>
+      <w:pPr>
+        <w:tabs>
+          <w:tab w:val="num" w:pos="2880"/>
+        </w:tabs>
+        <w:ind w:left="2880" w:hanging="360"/>
+      </w:pPr>
+    </w:lvl>
+    <w:lvl w:ilvl="4" w:tentative="1">
+      <w:start w:val="1"/>
+      <w:numFmt w:val="decimal"/>
+      <w:lvlText w:val="%5."/>
+      <w:lvlJc w:val="left"/>
+      <w:pPr>
+        <w:tabs>
+          <w:tab w:val="num" w:pos="3600"/>
+        </w:tabs>
+        <w:ind w:left="3600" w:hanging="360"/>
+      </w:pPr>
+    </w:lvl>
+    <w:lvl w:ilvl="5" w:tentative="1">
+      <w:start w:val="1"/>
+      <w:numFmt w:val="decimal"/>
+      <w:lvlText w:val="%6."/>
+      <w:lvlJc w:val="left"/>
+      <w:pPr>
+        <w:tabs>
+          <w:tab w:val="num" w:pos="4320"/>
+        </w:tabs>
+        <w:ind w:left="4320" w:hanging="360"/>
+      </w:pPr>
+    </w:lvl>
+    <w:lvl w:ilvl="6" w:tentative="1">
+      <w:start w:val="1"/>
+      <w:numFmt w:val="decimal"/>
+      <w:lvlText w:val="%7."/>
+      <w:lvlJc w:val="left"/>
+      <w:pPr>
+        <w:tabs>
+          <w:tab w:val="num" w:pos="5040"/>
+        </w:tabs>
+        <w:ind w:left="5040" w:hanging="360"/>
+      </w:pPr>
+    </w:lvl>
+    <w:lvl w:ilvl="7" w:tentative="1">
+      <w:start w:val="1"/>
+      <w:numFmt w:val="decimal"/>
+      <w:lvlText w:val="%8."/>
+      <w:lvlJc w:val="left"/>
+      <w:pPr>
+        <w:tabs>
+          <w:tab w:val="num" w:pos="5760"/>
+        </w:tabs>
+        <w:ind w:left="5760" w:hanging="360"/>
+      </w:pPr>
+    </w:lvl>
+    <w:lvl w:ilvl="8" w:tentative="1">
+      <w:start w:val="1"/>
+      <w:numFmt w:val="decimal"/>
+      <w:lvlText w:val="%9."/>
+      <w:lvlJc w:val="left"/>
+      <w:pPr>
+        <w:tabs>
+          <w:tab w:val="num" w:pos="6480"/>
+        </w:tabs>
+        <w:ind w:left="6480" w:hanging="360"/>
+      </w:pPr>
+    </w:lvl>
+  </w:abstractNum>
+  <w:abstractNum w:abstractNumId="3" w15:restartNumberingAfterBreak="0">
+    <w:nsid w:val="4C092EB4"/>
+    <w:multiLevelType w:val="multilevel"/>
+    <w:tmpl w:val="C89EEDE0"/>
+    <w:lvl w:ilvl="0">
+      <w:start w:val="1"/>
+      <w:numFmt w:val="bullet"/>
+      <w:lvlText w:val=""/>
+      <w:lvlJc w:val="left"/>
+      <w:pPr>
+        <w:tabs>
+          <w:tab w:val="num" w:pos="720"/>
+        </w:tabs>
+        <w:ind w:left="720" w:hanging="360"/>
+      </w:pPr>
+      <w:rPr>
+        <w:rFonts w:ascii="Symbol" w:hAnsi="Symbol" w:hint="default"/>
+        <w:sz w:val="20"/>
+      </w:rPr>
+    </w:lvl>
+    <w:lvl w:ilvl="1" w:tentative="1">
+      <w:start w:val="1"/>
+      <w:numFmt w:val="bullet"/>
+      <w:lvlText w:val="o"/>
+      <w:lvlJc w:val="left"/>
+      <w:pPr>
+        <w:tabs>
+          <w:tab w:val="num" w:pos="1440"/>
+        </w:tabs>
+        <w:ind w:left="1440" w:hanging="360"/>
+      </w:pPr>
+      <w:rPr>
+        <w:rFonts w:ascii="Courier New" w:hAnsi="Courier New" w:hint="default"/>
+        <w:sz w:val="20"/>
+      </w:rPr>
+    </w:lvl>
+    <w:lvl w:ilvl="2" w:tentative="1">
+      <w:start w:val="1"/>
+      <w:numFmt w:val="bullet"/>
+      <w:lvlText w:val=""/>
+      <w:lvlJc w:val="left"/>
+      <w:pPr>
+        <w:tabs>
+          <w:tab w:val="num" w:pos="2160"/>
+        </w:tabs>
+        <w:ind w:left="2160" w:hanging="360"/>
+      </w:pPr>
+      <w:rPr>
+        <w:rFonts w:ascii="Wingdings" w:hAnsi="Wingdings" w:hint="default"/>
+        <w:sz w:val="20"/>
+      </w:rPr>
+    </w:lvl>
+    <w:lvl w:ilvl="3" w:tentative="1">
+      <w:start w:val="1"/>
+      <w:numFmt w:val="bullet"/>
+      <w:lvlText w:val=""/>
+      <w:lvlJc w:val="left"/>
+      <w:pPr>
+        <w:tabs>
+          <w:tab w:val="num" w:pos="2880"/>
+        </w:tabs>
+        <w:ind w:left="2880" w:hanging="360"/>
+      </w:pPr>
+      <w:rPr>
+        <w:rFonts w:ascii="Wingdings" w:hAnsi="Wingdings" w:hint="default"/>
+        <w:sz w:val="20"/>
+      </w:rPr>
+    </w:lvl>
+    <w:lvl w:ilvl="4" w:tentative="1">
+      <w:start w:val="1"/>
+      <w:numFmt w:val="bullet"/>
+      <w:lvlText w:val=""/>
+      <w:lvlJc w:val="left"/>
+      <w:pPr>
+        <w:tabs>
+          <w:tab w:val="num" w:pos="3600"/>
+        </w:tabs>
+        <w:ind w:left="3600" w:hanging="360"/>
+      </w:pPr>
+      <w:rPr>
+        <w:rFonts w:ascii="Wingdings" w:hAnsi="Wingdings" w:hint="default"/>
+        <w:sz w:val="20"/>
+      </w:rPr>
+    </w:lvl>
+    <w:lvl w:ilvl="5" w:tentative="1">
+      <w:start w:val="1"/>
+      <w:numFmt w:val="bullet"/>
+      <w:lvlText w:val=""/>
+      <w:lvlJc w:val="left"/>
+      <w:pPr>
+        <w:tabs>
+          <w:tab w:val="num" w:pos="4320"/>
+        </w:tabs>
+        <w:ind w:left="4320" w:hanging="360"/>
+      </w:pPr>
+      <w:rPr>
+        <w:rFonts w:ascii="Wingdings" w:hAnsi="Wingdings" w:hint="default"/>
+        <w:sz w:val="20"/>
+      </w:rPr>
+    </w:lvl>
+    <w:lvl w:ilvl="6" w:tentative="1">
+      <w:start w:val="1"/>
+      <w:numFmt w:val="bullet"/>
+      <w:lvlText w:val=""/>
+      <w:lvlJc w:val="left"/>
+      <w:pPr>
+        <w:tabs>
+          <w:tab w:val="num" w:pos="5040"/>
+        </w:tabs>
+        <w:ind w:left="5040" w:hanging="360"/>
+      </w:pPr>
+      <w:rPr>
+        <w:rFonts w:ascii="Wingdings" w:hAnsi="Wingdings" w:hint="default"/>
+        <w:sz w:val="20"/>
+      </w:rPr>
+    </w:lvl>
+    <w:lvl w:ilvl="7" w:tentative="1">
+      <w:start w:val="1"/>
+      <w:numFmt w:val="bullet"/>
+      <w:lvlText w:val=""/>
+      <w:lvlJc w:val="left"/>
+      <w:pPr>
+        <w:tabs>
+          <w:tab w:val="num" w:pos="5760"/>
+        </w:tabs>
+        <w:ind w:left="5760" w:hanging="360"/>
+      </w:pPr>
+      <w:rPr>
+        <w:rFonts w:ascii="Wingdings" w:hAnsi="Wingdings" w:hint="default"/>
+        <w:sz w:val="20"/>
+      </w:rPr>
+    </w:lvl>
+    <w:lvl w:ilvl="8" w:tentative="1">
+      <w:start w:val="1"/>
+      <w:numFmt w:val="bullet"/>
+      <w:lvlText w:val=""/>
+      <w:lvlJc w:val="left"/>
+      <w:pPr>
+        <w:tabs>
+          <w:tab w:val="num" w:pos="6480"/>
+        </w:tabs>
+        <w:ind w:left="6480" w:hanging="360"/>
+      </w:pPr>
+      <w:rPr>
+        <w:rFonts w:ascii="Wingdings" w:hAnsi="Wingdings" w:hint="default"/>
+        <w:sz w:val="20"/>
+      </w:rPr>
+    </w:lvl>
+  </w:abstractNum>
+  <w:abstractNum w:abstractNumId="4" w15:restartNumberingAfterBreak="0">
+    <w:nsid w:val="56DA2091"/>
+    <w:multiLevelType w:val="multilevel"/>
+    <w:tmpl w:val="349EEDEC"/>
+    <w:lvl w:ilvl="0">
+      <w:start w:val="1"/>
+      <w:numFmt w:val="bullet"/>
+      <w:lvlText w:val=""/>
+      <w:lvlJc w:val="left"/>
+      <w:pPr>
+        <w:tabs>
+          <w:tab w:val="num" w:pos="720"/>
+        </w:tabs>
+        <w:ind w:left="720" w:hanging="360"/>
+      </w:pPr>
+      <w:rPr>
+        <w:rFonts w:ascii="Symbol" w:hAnsi="Symbol" w:hint="default"/>
+        <w:sz w:val="20"/>
+      </w:rPr>
+    </w:lvl>
+    <w:lvl w:ilvl="1" w:tentative="1">
+      <w:start w:val="1"/>
+      <w:numFmt w:val="bullet"/>
+      <w:lvlText w:val="o"/>
+      <w:lvlJc w:val="left"/>
+      <w:pPr>
+        <w:tabs>
+          <w:tab w:val="num" w:pos="1440"/>
+        </w:tabs>
+        <w:ind w:left="1440" w:hanging="360"/>
+      </w:pPr>
+      <w:rPr>
+        <w:rFonts w:ascii="Courier New" w:hAnsi="Courier New" w:hint="default"/>
+        <w:sz w:val="20"/>
+      </w:rPr>
+    </w:lvl>
+    <w:lvl w:ilvl="2" w:tentative="1">
+      <w:start w:val="1"/>
+      <w:numFmt w:val="bullet"/>
+      <w:lvlText w:val=""/>
+      <w:lvlJc w:val="left"/>
+      <w:pPr>
+        <w:tabs>
+          <w:tab w:val="num" w:pos="2160"/>
+        </w:tabs>
+        <w:ind w:left="2160" w:hanging="360"/>
+      </w:pPr>
+      <w:rPr>
+        <w:rFonts w:ascii="Wingdings" w:hAnsi="Wingdings" w:hint="default"/>
+        <w:sz w:val="20"/>
+      </w:rPr>
+    </w:lvl>
+    <w:lvl w:ilvl="3" w:tentative="1">
+      <w:start w:val="1"/>
+      <w:numFmt w:val="bullet"/>
+      <w:lvlText w:val=""/>
+      <w:lvlJc w:val="left"/>
+      <w:pPr>
+        <w:tabs>
+          <w:tab w:val="num" w:pos="2880"/>
+        </w:tabs>
+        <w:ind w:left="2880" w:hanging="360"/>
+      </w:pPr>
+      <w:rPr>
+        <w:rFonts w:ascii="Wingdings" w:hAnsi="Wingdings" w:hint="default"/>
+        <w:sz w:val="20"/>
+      </w:rPr>
+    </w:lvl>
+    <w:lvl w:ilvl="4" w:tentative="1">
+      <w:start w:val="1"/>
+      <w:numFmt w:val="bullet"/>
+      <w:lvlText w:val=""/>
+      <w:lvlJc w:val="left"/>
+      <w:pPr>
+        <w:tabs>
+          <w:tab w:val="num" w:pos="3600"/>
+        </w:tabs>
+        <w:ind w:left="3600" w:hanging="360"/>
+      </w:pPr>
+      <w:rPr>
+        <w:rFonts w:ascii="Wingdings" w:hAnsi="Wingdings" w:hint="default"/>
+        <w:sz w:val="20"/>
+      </w:rPr>
+    </w:lvl>
+    <w:lvl w:ilvl="5" w:tentative="1">
+      <w:start w:val="1"/>
+      <w:numFmt w:val="bullet"/>
+      <w:lvlText w:val=""/>
+      <w:lvlJc w:val="left"/>
+      <w:pPr>
+        <w:tabs>
+          <w:tab w:val="num" w:pos="4320"/>
+        </w:tabs>
+        <w:ind w:left="4320" w:hanging="360"/>
+      </w:pPr>
+      <w:rPr>
+        <w:rFonts w:ascii="Wingdings" w:hAnsi="Wingdings" w:hint="default"/>
+        <w:sz w:val="20"/>
+      </w:rPr>
+    </w:lvl>
+    <w:lvl w:ilvl="6" w:tentative="1">
+      <w:start w:val="1"/>
+      <w:numFmt w:val="bullet"/>
+      <w:lvlText w:val=""/>
+      <w:lvlJc w:val="left"/>
+      <w:pPr>
+        <w:tabs>
+          <w:tab w:val="num" w:pos="5040"/>
+        </w:tabs>
+        <w:ind w:left="5040" w:hanging="360"/>
+      </w:pPr>
+      <w:rPr>
+        <w:rFonts w:ascii="Wingdings" w:hAnsi="Wingdings" w:hint="default"/>
+        <w:sz w:val="20"/>
+      </w:rPr>
+    </w:lvl>
+    <w:lvl w:ilvl="7" w:tentative="1">
+      <w:start w:val="1"/>
+      <w:numFmt w:val="bullet"/>
+      <w:lvlText w:val=""/>
+      <w:lvlJc w:val="left"/>
+      <w:pPr>
+        <w:tabs>
+          <w:tab w:val="num" w:pos="5760"/>
+        </w:tabs>
+        <w:ind w:left="5760" w:hanging="360"/>
+      </w:pPr>
+      <w:rPr>
+        <w:rFonts w:ascii="Wingdings" w:hAnsi="Wingdings" w:hint="default"/>
+        <w:sz w:val="20"/>
+      </w:rPr>
+    </w:lvl>
+    <w:lvl w:ilvl="8" w:tentative="1">
+      <w:start w:val="1"/>
+      <w:numFmt w:val="bullet"/>
+      <w:lvlText w:val=""/>
+      <w:lvlJc w:val="left"/>
+      <w:pPr>
+        <w:tabs>
+          <w:tab w:val="num" w:pos="6480"/>
+        </w:tabs>
+        <w:ind w:left="6480" w:hanging="360"/>
+      </w:pPr>
+      <w:rPr>
+        <w:rFonts w:ascii="Wingdings" w:hAnsi="Wingdings" w:hint="default"/>
+        <w:sz w:val="20"/>
+      </w:rPr>
+    </w:lvl>
+  </w:abstractNum>
+  <w:abstractNum w:abstractNumId="5" w15:restartNumberingAfterBreak="0">
+    <w:nsid w:val="629C3B58"/>
+    <w:multiLevelType w:val="multilevel"/>
+    <w:tmpl w:val="A40A8AB8"/>
+    <w:lvl w:ilvl="0">
+      <w:start w:val="1"/>
+      <w:numFmt w:val="bullet"/>
+      <w:lvlText w:val=""/>
+      <w:lvlJc w:val="left"/>
+      <w:pPr>
+        <w:tabs>
+          <w:tab w:val="num" w:pos="720"/>
+        </w:tabs>
+        <w:ind w:left="720" w:hanging="360"/>
+      </w:pPr>
+      <w:rPr>
+        <w:rFonts w:ascii="Symbol" w:hAnsi="Symbol" w:hint="default"/>
+        <w:sz w:val="20"/>
+      </w:rPr>
+    </w:lvl>
+    <w:lvl w:ilvl="1" w:tentative="1">
+      <w:start w:val="1"/>
+      <w:numFmt w:val="bullet"/>
+      <w:lvlText w:val="o"/>
+      <w:lvlJc w:val="left"/>
+      <w:pPr>
+        <w:tabs>
+          <w:tab w:val="num" w:pos="1440"/>
+        </w:tabs>
+        <w:ind w:left="1440" w:hanging="360"/>
+      </w:pPr>
+      <w:rPr>
+        <w:rFonts w:ascii="Courier New" w:hAnsi="Courier New" w:hint="default"/>
+        <w:sz w:val="20"/>
+      </w:rPr>
+    </w:lvl>
+    <w:lvl w:ilvl="2" w:tentative="1">
+      <w:start w:val="1"/>
+      <w:numFmt w:val="bullet"/>
+      <w:lvlText w:val=""/>
+      <w:lvlJc w:val="left"/>
+      <w:pPr>
+        <w:tabs>
+          <w:tab w:val="num" w:pos="2160"/>
+        </w:tabs>
+        <w:ind w:left="2160" w:hanging="360"/>
+      </w:pPr>
+      <w:rPr>
+        <w:rFonts w:ascii="Wingdings" w:hAnsi="Wingdings" w:hint="default"/>
+        <w:sz w:val="20"/>
+      </w:rPr>
+    </w:lvl>
+    <w:lvl w:ilvl="3" w:tentative="1">
+      <w:start w:val="1"/>
+      <w:numFmt w:val="bullet"/>
+      <w:lvlText w:val=""/>
+      <w:lvlJc w:val="left"/>
+      <w:pPr>
+        <w:tabs>
+          <w:tab w:val="num" w:pos="2880"/>
+        </w:tabs>
+        <w:ind w:left="2880" w:hanging="360"/>
+      </w:pPr>
+      <w:rPr>
+        <w:rFonts w:ascii="Wingdings" w:hAnsi="Wingdings" w:hint="default"/>
+        <w:sz w:val="20"/>
+      </w:rPr>
+    </w:lvl>
+    <w:lvl w:ilvl="4" w:tentative="1">
+      <w:start w:val="1"/>
+      <w:numFmt w:val="bullet"/>
+      <w:lvlText w:val=""/>
+      <w:lvlJc w:val="left"/>
+      <w:pPr>
+        <w:tabs>
+          <w:tab w:val="num" w:pos="3600"/>
+        </w:tabs>
+        <w:ind w:left="3600" w:hanging="360"/>
+      </w:pPr>
+      <w:rPr>
+        <w:rFonts w:ascii="Wingdings" w:hAnsi="Wingdings" w:hint="default"/>
+        <w:sz w:val="20"/>
+      </w:rPr>
+    </w:lvl>
+    <w:lvl w:ilvl="5" w:tentative="1">
+      <w:start w:val="1"/>
+      <w:numFmt w:val="bullet"/>
+      <w:lvlText w:val=""/>
+      <w:lvlJc w:val="left"/>
+      <w:pPr>
+        <w:tabs>
+          <w:tab w:val="num" w:pos="4320"/>
+        </w:tabs>
+        <w:ind w:left="4320" w:hanging="360"/>
+      </w:pPr>
+      <w:rPr>
+        <w:rFonts w:ascii="Wingdings" w:hAnsi="Wingdings" w:hint="default"/>
+        <w:sz w:val="20"/>
+      </w:rPr>
+    </w:lvl>
+    <w:lvl w:ilvl="6" w:tentative="1">
+      <w:start w:val="1"/>
+      <w:numFmt w:val="bullet"/>
+      <w:lvlText w:val=""/>
+      <w:lvlJc w:val="left"/>
+      <w:pPr>
+        <w:tabs>
+          <w:tab w:val="num" w:pos="5040"/>
+        </w:tabs>
+        <w:ind w:left="5040" w:hanging="360"/>
+      </w:pPr>
+      <w:rPr>
+        <w:rFonts w:ascii="Wingdings" w:hAnsi="Wingdings" w:hint="default"/>
+        <w:sz w:val="20"/>
+      </w:rPr>
+    </w:lvl>
+    <w:lvl w:ilvl="7" w:tentative="1">
+      <w:start w:val="1"/>
+      <w:numFmt w:val="bullet"/>
+      <w:lvlText w:val=""/>
+      <w:lvlJc w:val="left"/>
+      <w:pPr>
+        <w:tabs>
+          <w:tab w:val="num" w:pos="5760"/>
+        </w:tabs>
+        <w:ind w:left="5760" w:hanging="360"/>
+      </w:pPr>
+      <w:rPr>
+        <w:rFonts w:ascii="Wingdings" w:hAnsi="Wingdings" w:hint="default"/>
+        <w:sz w:val="20"/>
+      </w:rPr>
+    </w:lvl>
+    <w:lvl w:ilvl="8" w:tentative="1">
+      <w:start w:val="1"/>
+      <w:numFmt w:val="bullet"/>
+      <w:lvlText w:val=""/>
+      <w:lvlJc w:val="left"/>
+      <w:pPr>
+        <w:tabs>
+          <w:tab w:val="num" w:pos="6480"/>
+        </w:tabs>
+        <w:ind w:left="6480" w:hanging="360"/>
+      </w:pPr>
+      <w:rPr>
+        <w:rFonts w:ascii="Wingdings" w:hAnsi="Wingdings" w:hint="default"/>
+        <w:sz w:val="20"/>
+      </w:rPr>
+    </w:lvl>
+  </w:abstractNum>
+  <w:abstractNum w:abstractNumId="6" w15:restartNumberingAfterBreak="0">
+    <w:nsid w:val="7AC24276"/>
+    <w:multiLevelType w:val="multilevel"/>
+    <w:tmpl w:val="F596351E"/>
+    <w:lvl w:ilvl="0">
+      <w:start w:val="1"/>
+      <w:numFmt w:val="decimal"/>
+      <w:lvlText w:val="%1."/>
+      <w:lvlJc w:val="left"/>
+      <w:pPr>
+        <w:tabs>
+          <w:tab w:val="num" w:pos="720"/>
+        </w:tabs>
+        <w:ind w:left="720" w:hanging="360"/>
+      </w:pPr>
+    </w:lvl>
+    <w:lvl w:ilvl="1" w:tentative="1">
+      <w:start w:val="1"/>
+      <w:numFmt w:val="decimal"/>
+      <w:lvlText w:val="%2."/>
+      <w:lvlJc w:val="left"/>
+      <w:pPr>
+        <w:tabs>
+          <w:tab w:val="num" w:pos="1440"/>
+        </w:tabs>
+        <w:ind w:left="1440" w:hanging="360"/>
+      </w:pPr>
+    </w:lvl>
+    <w:lvl w:ilvl="2" w:tentative="1">
+      <w:start w:val="1"/>
+      <w:numFmt w:val="decimal"/>
+      <w:lvlText w:val="%3."/>
+      <w:lvlJc w:val="left"/>
+      <w:pPr>
+        <w:tabs>
+          <w:tab w:val="num" w:pos="2160"/>
+        </w:tabs>
+        <w:ind w:left="2160" w:hanging="360"/>
+      </w:pPr>
+    </w:lvl>
+    <w:lvl w:ilvl="3" w:tentative="1">
+      <w:start w:val="1"/>
+      <w:numFmt w:val="decimal"/>
+      <w:lvlText w:val="%4."/>
+      <w:lvlJc w:val="left"/>
+      <w:pPr>
+        <w:tabs>
+          <w:tab w:val="num" w:pos="2880"/>
+        </w:tabs>
+        <w:ind w:left="2880" w:hanging="360"/>
+      </w:pPr>
+    </w:lvl>
+    <w:lvl w:ilvl="4" w:tentative="1">
+      <w:start w:val="1"/>
+      <w:numFmt w:val="decimal"/>
+      <w:lvlText w:val="%5."/>
+      <w:lvlJc w:val="left"/>
+      <w:pPr>
+        <w:tabs>
+          <w:tab w:val="num" w:pos="3600"/>
+        </w:tabs>
+        <w:ind w:left="3600" w:hanging="360"/>
+      </w:pPr>
+    </w:lvl>
+    <w:lvl w:ilvl="5" w:tentative="1">
+      <w:start w:val="1"/>
+      <w:numFmt w:val="decimal"/>
+      <w:lvlText w:val="%6."/>
+      <w:lvlJc w:val="left"/>
+      <w:pPr>
+        <w:tabs>
+          <w:tab w:val="num" w:pos="4320"/>
+        </w:tabs>
+        <w:ind w:left="4320" w:hanging="360"/>
+      </w:pPr>
+    </w:lvl>
+    <w:lvl w:ilvl="6" w:tentative="1">
+      <w:start w:val="1"/>
+      <w:numFmt w:val="decimal"/>
+      <w:lvlText w:val="%7."/>
+      <w:lvlJc w:val="left"/>
+      <w:pPr>
+        <w:tabs>
+          <w:tab w:val="num" w:pos="5040"/>
+        </w:tabs>
+        <w:ind w:left="5040" w:hanging="360"/>
+      </w:pPr>
+    </w:lvl>
+    <w:lvl w:ilvl="7" w:tentative="1">
+      <w:start w:val="1"/>
+      <w:numFmt w:val="decimal"/>
+      <w:lvlText w:val="%8."/>
+      <w:lvlJc w:val="left"/>
+      <w:pPr>
+        <w:tabs>
+          <w:tab w:val="num" w:pos="5760"/>
+        </w:tabs>
+        <w:ind w:left="5760" w:hanging="360"/>
+      </w:pPr>
+    </w:lvl>
+    <w:lvl w:ilvl="8" w:tentative="1">
+      <w:start w:val="1"/>
+      <w:numFmt w:val="decimal"/>
+      <w:lvlText w:val="%9."/>
+      <w:lvlJc w:val="left"/>
+      <w:pPr>
+        <w:tabs>
+          <w:tab w:val="num" w:pos="6480"/>
+        </w:tabs>
+        <w:ind w:left="6480" w:hanging="360"/>
+      </w:pPr>
+    </w:lvl>
+  </w:abstractNum>
   <w:num w:numId="1" w16cid:durableId="271010052">
+    <w:abstractNumId w:val="1"/>
+  </w:num>
+  <w:num w:numId="2" w16cid:durableId="477262739">
+    <w:abstractNumId w:val="6"/>
+  </w:num>
+  <w:num w:numId="3" w16cid:durableId="554243511">
+    <w:abstractNumId w:val="5"/>
+  </w:num>
+  <w:num w:numId="4" w16cid:durableId="770928813">
+    <w:abstractNumId w:val="3"/>
+  </w:num>
+  <w:num w:numId="5" w16cid:durableId="220944155">
+    <w:abstractNumId w:val="4"/>
+  </w:num>
+  <w:num w:numId="6" w16cid:durableId="1715349382">
     <w:abstractNumId w:val="0"/>
+  </w:num>
+  <w:num w:numId="7" w16cid:durableId="382288143">
+    <w:abstractNumId w:val="2"/>
   </w:num>
 </w:numbering>
 </file>
@@ -920,7 +2448,6 @@
     <w:next w:val="Normal"/>
     <w:link w:val="Heading2Char"/>
     <w:uiPriority w:val="9"/>
-    <w:semiHidden/>
     <w:unhideWhenUsed/>
     <w:qFormat/>
     <w:rsid w:val="00E21BBA"/>
@@ -1136,7 +2663,6 @@
     <w:basedOn w:val="DefaultParagraphFont"/>
     <w:link w:val="Heading2"/>
     <w:uiPriority w:val="9"/>
-    <w:semiHidden/>
     <w:rsid w:val="00E21BBA"/>
     <w:rPr>
       <w:rFonts w:asciiTheme="majorHAnsi" w:eastAsiaTheme="majorEastAsia" w:hAnsiTheme="majorHAnsi" w:cstheme="majorBidi"/>

</xml_diff>